<commit_message>
docs: embed process overview diagram in BRD
Adds an unnumbered "Process Overview" section right before §1, with the
chilling-centre workflow diagram matching the current v4.0 MVP scope
exactly: Milk Arrival, Reception & Testing, Quality Decision, Local Save,
Held in Chilling Centre, Rate Chart Reference, Notification Hook, and
Cloud. No existing section numbering disturbed - inserted before §1, not
between existing sections.

Co-Authored-By: Claude Sonnet 5 <noreply@anthropic.com>
Claude-Session: https://claude.ai/code/session_018XSGSuqhf83TsKy431C6RX
</commit_message>
<xml_diff>
--- a/Doc/CCMC_BRD_and_Technical_Design_v2.docx
+++ b/Doc/CCMC_BRD_and_Technical_Design_v2.docx
@@ -81,6 +81,62 @@
       </w:pPr>
       <w:r>
         <w:br w:type="page"/>
+      </w:r>
+    </w:p>
+    <w:p>
+      <w:pPr>
+        <w:pStyle w:val="Heading1"/>
+      </w:pPr>
+      <w:r>
+        <w:t>Process Overview</w:t>
+      </w:r>
+    </w:p>
+    <w:p>
+      <w:pPr>
+        <w:jc w:val="center"/>
+      </w:pPr>
+      <w:r>
+        <w:drawing>
+          <wp:inline xmlns:a="http://schemas.openxmlformats.org/drawingml/2006/main" xmlns:pic="http://schemas.openxmlformats.org/drawingml/2006/picture">
+            <wp:extent cx="5943600" cy="2377440"/>
+            <wp:docPr id="1" name="Picture 1"/>
+            <wp:cNvGraphicFramePr>
+              <a:graphicFrameLocks noChangeAspect="1"/>
+            </wp:cNvGraphicFramePr>
+            <a:graphic>
+              <a:graphicData uri="http://schemas.openxmlformats.org/drawingml/2006/picture">
+                <pic:pic>
+                  <pic:nvPicPr>
+                    <pic:cNvPr id="0" name="diagram.png"/>
+                    <pic:cNvPicPr/>
+                  </pic:nvPicPr>
+                  <pic:blipFill>
+                    <a:blip r:embed="rId11"/>
+                    <a:stretch>
+                      <a:fillRect/>
+                    </a:stretch>
+                  </pic:blipFill>
+                  <pic:spPr>
+                    <a:xfrm>
+                      <a:off x="0" y="0"/>
+                      <a:ext cx="5943600" cy="2377440"/>
+                    </a:xfrm>
+                    <a:prstGeom prst="rect"/>
+                  </pic:spPr>
+                </pic:pic>
+              </a:graphicData>
+            </a:graphic>
+          </wp:inline>
+        </w:drawing>
+      </w:r>
+    </w:p>
+    <w:p>
+      <w:pPr/>
+      <w:r>
+        <w:rPr>
+          <w:i/>
+        </w:rPr>
+        <w:t>The chilling centre process as scoped for the Windows application and cloud API MVP (v4.0): milk arrival through reception, quality decision, local save, and holding at the centre, with a read-only rate-chart reference and a notification hook attached to the steps they serve, syncing to a central cloud system for RBAC, audit and reporting. See §17 for the full MVP scope and §22 for what is explicitly out of scope.</w:t>
       </w:r>
     </w:p>
     <w:p>

</xml_diff>

<commit_message>
docs: document Quality Decision as manual, not automatic (BRD v6.0)
The latest pull's ReceptionWorkflowService already implements this: the
automatic ACCEPTED/HOLD/REJECTED suggestion from quality-rule validation
is advisory only - the Result actually persisted is the operator's own
explicit decision, never auto-applied by the system. Verified against
source before writing this up, not assumed.

This was a real, undocumented behavior change from the BRD's original
framing (§1/§9/§12/§19's workflow diagrams show "Validate Quality"
flowing directly into "ACCEPT/HOLD/REJECT" without saying who decides).
Amendment notes added at §10 and §18 rather than rewriting the diagrams,
which are still shape-accurate. context.md's "Scope Decisions" gains
item #11 with the same record.

Co-Authored-By: Claude Sonnet 5 <noreply@anthropic.com>
Claude-Session: https://claude.ai/code/session_018XSGSuqhf83TsKy431C6RX
</commit_message>
<xml_diff>
--- a/Doc/CCMC_BRD_and_Technical_Design_v2.docx
+++ b/Doc/CCMC_BRD_and_Technical_Design_v2.docx
@@ -46,7 +46,7 @@
         </w:rPr>
       </w:pPr>
       <w:r>
-        <w:t>Version 5.0  •  September 2026  •  Rate Calculation Added to MVP</w:t>
+        <w:t>Version 6.0  •  September 2026  •  Quality Decision Clarified — Manual, Not Automatic</w:t>
       </w:r>
     </w:p>
     <w:p>
@@ -76,6 +76,11 @@
     <w:p>
       <w:r>
         <w:t>Changelog (v5.0): Rate Chart Reference upgraded from a read-only display to a live Rate and Amount CALCULATION per collection, ported from an existing reference implementation (legacy Android app: MilkCollectionFragment.getAmount(), RateFormulaFragment, branch offline-db) - see new §25 for the full formula spec. Scope boundary drawn precisely: computing Rate/Amount for a single collection, from already-configured rate settings, is now in MVP (§17); authoring/managing per-farmer rate charts and farmer/pourer SETTLEMENT (ledger, advances, incentives, periodic payment cycles) remain out of scope, unchanged from §20/§24 - see the amendment notes at both.</w:t>
+      </w:r>
+    </w:p>
+    <w:p>
+      <w:r>
+        <w:t>Changelog (v6.0): Documents a product decision found already implemented in code (this pass verified it against source, not assumed): the automatic ACCEPTED/HOLD/REJECTED suggestion computed by quality-rule validation is advisory only. The system still computes it, but the Result actually persisted on the transaction is the operator's own explicit decision - a human must always press the decision, the system never auto-applies its own suggestion. See the amendment notes under §10 and §18. This is a real change from this BRD's earlier framing (§1, §9, §12, §19's workflow diagrams showed "Validate Quality" flowing directly into "ACCEPT/HOLD/REJECT" without specifying who decides) - the diagrams' shape is still accurate, only the mechanics needed spelling out.</w:t>
       </w:r>
     </w:p>
     <w:p>
@@ -3418,6 +3423,14 @@
       </w:r>
     </w:p>
     <w:p>
+      <w:r>
+        <w:rPr>
+          <w:b/>
+        </w:rPr>
+        <w:t>Amended (v6.0): quality-rule validation computes a suggested Result, but it is advisory only. The Result actually persisted is the operator's own explicit decision, made after reviewing the readings and the suggestion - the system never auto-applies its own suggestion. This applies to every "Validate"/"Validate Quality" step referenced elsewhere in this document (§1, §9, §12, §19).</w:t>
+      </w:r>
+    </w:p>
+    <w:p>
       <w:pPr/>
       <w:r>
         <w:t>Note (v2.1): Acidity, Clot-on-Boiling (COB) and antibiotic/adulteration testing are deferred, not in scope for now — no verified measurement instrument or protocol is currently available for these parameters. FAT/SNF/CLR/Temperature remain the quality gate. Revisit once a device/method is identified; see §22.</w:t>
@@ -4543,6 +4556,14 @@
       </w:pPr>
       <w:r>
         <w:t>Quality validation and ACCEPTED / HOLD / REJECTED decisions work.</w:t>
+      </w:r>
+    </w:p>
+    <w:p>
+      <w:r>
+        <w:rPr>
+          <w:b/>
+        </w:rPr>
+        <w:t>Amended (v6.0): read as "quality validation computes a suggestion, and the operator's own explicit Accept/Hold/Reject decision is what gets persisted" - see §10.</w:t>
       </w:r>
     </w:p>
     <w:p>

</xml_diff>